<commit_message>
OOP:lab4-5:successfull rework. MVVM pattern implemented
</commit_message>
<xml_diff>
--- a/OOP/Lab texts/4_5_WPF_shop_service.docx
+++ b/OOP/Lab texts/4_5_WPF_shop_service.docx
@@ -81,6 +81,7 @@
         </w:rPr>
         <w:t>-</w:t>
       </w:r>
+      <w:proofErr w:type="gramStart"/>
       <w:r>
         <w:rPr>
           <w:rFonts w:eastAsia="Times New Roman"/>
@@ -155,8 +156,9 @@
             <w14:round/>
           </w14:textOutline>
         </w:rPr>
-        <w:t>Программное средство продажи товаров или услуг</w:t>
-      </w:r>
+        <w:t>Программное</w:t>
+      </w:r>
+      <w:proofErr w:type="gramEnd"/>
       <w:r>
         <w:rPr>
           <w:rFonts w:eastAsia="Times New Roman"/>
@@ -174,7 +176,7 @@
             <w14:round/>
           </w14:textOutline>
         </w:rPr>
-        <w:t xml:space="preserve"> на </w:t>
+        <w:t xml:space="preserve"> средство продажи товаров или услуг</w:t>
       </w:r>
       <w:r>
         <w:rPr>
@@ -193,6 +195,25 @@
             <w14:round/>
           </w14:textOutline>
         </w:rPr>
+        <w:t xml:space="preserve"> на </w:t>
+      </w:r>
+      <w:r>
+        <w:rPr>
+          <w:rFonts w:eastAsia="Times New Roman"/>
+          <w:b/>
+          <w:color w:val="000000" w:themeColor="text1"/>
+          <w:lang w:eastAsia="ru-RU"/>
+          <w14:shadow w14:blurRad="38100" w14:dist="19050" w14:dir="2700000" w14:sx="100000" w14:sy="100000" w14:kx="0" w14:ky="0" w14:algn="tl">
+            <w14:schemeClr w14:val="dk1">
+              <w14:alpha w14:val="60000"/>
+            </w14:schemeClr>
+          </w14:shadow>
+          <w14:textOutline w14:w="0" w14:cap="flat" w14:cmpd="sng" w14:algn="ctr">
+            <w14:noFill/>
+            <w14:prstDash w14:val="solid"/>
+            <w14:round/>
+          </w14:textOutline>
+        </w:rPr>
         <w:t xml:space="preserve"> </w:t>
       </w:r>
       <w:r>
@@ -284,6 +305,7 @@
           <w:lang w:eastAsia="ru-RU"/>
         </w:rPr>
       </w:pPr>
+      <w:proofErr w:type="gramStart"/>
       <w:r>
         <w:rPr>
           <w:rFonts w:ascii="Times New Roman" w:eastAsia="Times New Roman" w:hAnsi="Times New Roman" w:cs="Times New Roman"/>
@@ -312,7 +334,18 @@
           <w:szCs w:val="28"/>
           <w:lang w:eastAsia="ru-RU"/>
         </w:rPr>
-        <w:t xml:space="preserve">приложение для </w:t>
+        <w:t>приложение</w:t>
+      </w:r>
+      <w:proofErr w:type="gramEnd"/>
+      <w:r>
+        <w:rPr>
+          <w:rFonts w:ascii="Times New Roman" w:eastAsia="Times New Roman" w:hAnsi="Times New Roman" w:cs="Times New Roman"/>
+          <w:color w:val="000000"/>
+          <w:sz w:val="28"/>
+          <w:szCs w:val="28"/>
+          <w:lang w:eastAsia="ru-RU"/>
+        </w:rPr>
+        <w:t xml:space="preserve"> для </w:t>
       </w:r>
       <w:r>
         <w:rPr>
@@ -852,15 +885,33 @@
           <w:sz w:val="28"/>
           <w:szCs w:val="28"/>
         </w:rPr>
-        <w:t xml:space="preserve"> создать одно о</w:t>
-      </w:r>
-      <w:r>
-        <w:rPr>
-          <w:color w:val="000000"/>
-          <w:sz w:val="28"/>
-          <w:szCs w:val="28"/>
-        </w:rPr>
-        <w:t>кно раздел</w:t>
+        <w:t xml:space="preserve"> создать </w:t>
+      </w:r>
+      <w:proofErr w:type="gramStart"/>
+      <w:r>
+        <w:rPr>
+          <w:color w:val="000000"/>
+          <w:sz w:val="28"/>
+          <w:szCs w:val="28"/>
+        </w:rPr>
+        <w:t>одно о</w:t>
+      </w:r>
+      <w:r>
+        <w:rPr>
+          <w:color w:val="000000"/>
+          <w:sz w:val="28"/>
+          <w:szCs w:val="28"/>
+        </w:rPr>
+        <w:t>кно</w:t>
+      </w:r>
+      <w:proofErr w:type="gramEnd"/>
+      <w:r>
+        <w:rPr>
+          <w:color w:val="000000"/>
+          <w:sz w:val="28"/>
+          <w:szCs w:val="28"/>
+        </w:rPr>
+        <w:t xml:space="preserve"> раздел</w:t>
       </w:r>
       <w:r>
         <w:rPr>
@@ -1159,6 +1210,7 @@
         <w:t xml:space="preserve">, </w:t>
       </w:r>
       <w:proofErr w:type="spellStart"/>
+      <w:proofErr w:type="gramStart"/>
       <w:r>
         <w:rPr>
           <w:color w:val="000000"/>
@@ -1175,15 +1227,40 @@
           <w:sz w:val="28"/>
           <w:szCs w:val="28"/>
         </w:rPr>
-        <w:t xml:space="preserve">  и т.д.</w:t>
-      </w:r>
-      <w:r>
-        <w:rPr>
-          <w:color w:val="000000"/>
-          <w:sz w:val="28"/>
-          <w:szCs w:val="28"/>
-        </w:rPr>
-        <w:t>) и свойства.</w:t>
+        <w:t xml:space="preserve">  и</w:t>
+      </w:r>
+      <w:proofErr w:type="gramEnd"/>
+      <w:r>
+        <w:rPr>
+          <w:color w:val="000000"/>
+          <w:sz w:val="28"/>
+          <w:szCs w:val="28"/>
+        </w:rPr>
+        <w:t xml:space="preserve"> т.д.</w:t>
+      </w:r>
+      <w:r>
+        <w:rPr>
+          <w:color w:val="000000"/>
+          <w:sz w:val="28"/>
+          <w:szCs w:val="28"/>
+        </w:rPr>
+        <w:t>) и свойств</w:t>
+      </w:r>
+      <w:r>
+        <w:rPr>
+          <w:color w:val="000000"/>
+          <w:sz w:val="28"/>
+          <w:szCs w:val="28"/>
+        </w:rPr>
+        <w:tab/>
+      </w:r>
+      <w:r>
+        <w:rPr>
+          <w:color w:val="000000"/>
+          <w:sz w:val="28"/>
+          <w:szCs w:val="28"/>
+        </w:rPr>
+        <w:t>а.</w:t>
       </w:r>
       <w:r>
         <w:rPr>
@@ -1199,7 +1276,16 @@
           <w:sz w:val="28"/>
           <w:szCs w:val="28"/>
         </w:rPr>
-        <w:t>Можно использовать  </w:t>
+        <w:t xml:space="preserve">Можно </w:t>
+      </w:r>
+      <w:proofErr w:type="gramStart"/>
+      <w:r>
+        <w:rPr>
+          <w:color w:val="000000"/>
+          <w:sz w:val="28"/>
+          <w:szCs w:val="28"/>
+        </w:rPr>
+        <w:t>использовать  </w:t>
       </w:r>
       <w:proofErr w:type="spellStart"/>
       <w:r>
@@ -1211,6 +1297,7 @@
         <w:t>Ribbon</w:t>
       </w:r>
       <w:proofErr w:type="spellEnd"/>
+      <w:proofErr w:type="gramEnd"/>
       <w:r>
         <w:rPr>
           <w:color w:val="000000"/>

</xml_diff>